<commit_message>
Finished 4 slides of lesson 6
</commit_message>
<xml_diff>
--- a/running_robot/Lessons Plan.docx
+++ b/running_robot/Lessons Plan.docx
@@ -322,6 +322,30 @@
         <w:rPr>
           <w:rFonts w:ascii="Times New Roman" w:eastAsia="Times New Roman" w:hAnsi="Times New Roman" w:cs="Times New Roman"/>
           <w:kern w:val="0"/>
+          <w:highlight w:val="cyan"/>
+          <w14:ligatures w14:val="none"/>
+        </w:rPr>
+      </w:pPr>
+      <w:r>
+        <w:rPr>
+          <w:rFonts w:ascii="Times New Roman" w:eastAsia="Times New Roman" w:hAnsi="Times New Roman" w:cs="Times New Roman"/>
+          <w:kern w:val="0"/>
+          <w:highlight w:val="cyan"/>
+          <w14:ligatures w14:val="none"/>
+        </w:rPr>
+        <w:t>Features</w:t>
+      </w:r>
+    </w:p>
+    <w:p>
+      <w:pPr>
+        <w:numPr>
+          <w:ilvl w:val="0"/>
+          <w:numId w:val="1"/>
+        </w:numPr>
+        <w:spacing w:before="100" w:beforeAutospacing="1" w:after="100" w:afterAutospacing="1" w:line="240" w:lineRule="auto"/>
+        <w:rPr>
+          <w:rFonts w:ascii="Times New Roman" w:eastAsia="Times New Roman" w:hAnsi="Times New Roman" w:cs="Times New Roman"/>
+          <w:kern w:val="0"/>
           <w:highlight w:val="green"/>
           <w14:ligatures w14:val="none"/>
         </w:rPr>
@@ -381,6 +405,54 @@
           <w:highlight w:val="green"/>
           <w14:ligatures w14:val="none"/>
         </w:rPr>
+        <w:t>Noise &amp; Missing Data</w:t>
+      </w:r>
+    </w:p>
+    <w:p>
+      <w:pPr>
+        <w:numPr>
+          <w:ilvl w:val="0"/>
+          <w:numId w:val="1"/>
+        </w:numPr>
+        <w:spacing w:before="100" w:beforeAutospacing="1" w:after="100" w:afterAutospacing="1" w:line="240" w:lineRule="auto"/>
+        <w:rPr>
+          <w:rFonts w:ascii="Times New Roman" w:eastAsia="Times New Roman" w:hAnsi="Times New Roman" w:cs="Times New Roman"/>
+          <w:kern w:val="0"/>
+          <w:highlight w:val="green"/>
+          <w14:ligatures w14:val="none"/>
+        </w:rPr>
+      </w:pPr>
+      <w:r>
+        <w:rPr>
+          <w:rFonts w:ascii="Times New Roman" w:eastAsia="Times New Roman" w:hAnsi="Times New Roman" w:cs="Times New Roman"/>
+          <w:kern w:val="0"/>
+          <w:highlight w:val="green"/>
+          <w14:ligatures w14:val="none"/>
+        </w:rPr>
+        <w:t>Encoding</w:t>
+      </w:r>
+    </w:p>
+    <w:p>
+      <w:pPr>
+        <w:numPr>
+          <w:ilvl w:val="0"/>
+          <w:numId w:val="1"/>
+        </w:numPr>
+        <w:spacing w:before="100" w:beforeAutospacing="1" w:after="100" w:afterAutospacing="1" w:line="240" w:lineRule="auto"/>
+        <w:rPr>
+          <w:rFonts w:ascii="Times New Roman" w:eastAsia="Times New Roman" w:hAnsi="Times New Roman" w:cs="Times New Roman"/>
+          <w:kern w:val="0"/>
+          <w:highlight w:val="green"/>
+          <w14:ligatures w14:val="none"/>
+        </w:rPr>
+      </w:pPr>
+      <w:r>
+        <w:rPr>
+          <w:rFonts w:ascii="Times New Roman" w:eastAsia="Times New Roman" w:hAnsi="Times New Roman" w:cs="Times New Roman"/>
+          <w:kern w:val="0"/>
+          <w:highlight w:val="green"/>
+          <w14:ligatures w14:val="none"/>
+        </w:rPr>
         <w:t>Structured Data</w:t>
       </w:r>
       <w:r>
@@ -400,30 +472,6 @@
           <w14:ligatures w14:val="none"/>
         </w:rPr>
         <w:t>Unstructured Data</w:t>
-      </w:r>
-    </w:p>
-    <w:p>
-      <w:pPr>
-        <w:numPr>
-          <w:ilvl w:val="0"/>
-          <w:numId w:val="1"/>
-        </w:numPr>
-        <w:spacing w:before="100" w:beforeAutospacing="1" w:after="100" w:afterAutospacing="1" w:line="240" w:lineRule="auto"/>
-        <w:rPr>
-          <w:rFonts w:ascii="Times New Roman" w:eastAsia="Times New Roman" w:hAnsi="Times New Roman" w:cs="Times New Roman"/>
-          <w:kern w:val="0"/>
-          <w:highlight w:val="green"/>
-          <w14:ligatures w14:val="none"/>
-        </w:rPr>
-      </w:pPr>
-      <w:r>
-        <w:rPr>
-          <w:rFonts w:ascii="Times New Roman" w:eastAsia="Times New Roman" w:hAnsi="Times New Roman" w:cs="Times New Roman"/>
-          <w:kern w:val="0"/>
-          <w:highlight w:val="green"/>
-          <w14:ligatures w14:val="none"/>
-        </w:rPr>
-        <w:t>Noise &amp; Missing Data</w:t>
       </w:r>
     </w:p>
     <w:p>
@@ -937,6 +985,7 @@
           <w:kern w:val="0"/>
           <w14:ligatures w14:val="none"/>
         </w:rPr>
+        <w:lastRenderedPageBreak/>
         <w:t>Unsupervised Learning (real-world examples)</w:t>
       </w:r>
     </w:p>
@@ -981,7 +1030,6 @@
           <w:kern w:val="0"/>
           <w14:ligatures w14:val="none"/>
         </w:rPr>
-        <w:lastRenderedPageBreak/>
         <w:t>Reinforcement Learning (real-world examples)</w:t>
       </w:r>
     </w:p>
@@ -1739,6 +1787,7 @@
           <w:kern w:val="0"/>
           <w14:ligatures w14:val="none"/>
         </w:rPr>
+        <w:lastRenderedPageBreak/>
         <w:t>Overfitting (in detail)</w:t>
       </w:r>
     </w:p>
@@ -1783,7 +1832,6 @@
           <w:kern w:val="0"/>
           <w14:ligatures w14:val="none"/>
         </w:rPr>
-        <w:lastRenderedPageBreak/>
         <w:t>Regularization Methods (L1, L2, dropout overview)</w:t>
       </w:r>
     </w:p>
@@ -2497,6 +2545,7 @@
           <w:kern w:val="0"/>
           <w14:ligatures w14:val="none"/>
         </w:rPr>
+        <w:lastRenderedPageBreak/>
         <w:t>Transformer Architecture (encoder-decoder overview)</w:t>
       </w:r>
     </w:p>
@@ -2541,7 +2590,6 @@
           <w:kern w:val="0"/>
           <w14:ligatures w14:val="none"/>
         </w:rPr>
-        <w:lastRenderedPageBreak/>
         <w:t>BERT (masked language modeling)</w:t>
       </w:r>
     </w:p>

</xml_diff>